<commit_message>
chore: geradores de informacoes (arquivamento, desconto folha finalizados, seletivos), skill enviar-informacao, docs adelia e ajustes nereu
</commit_message>
<xml_diff>
--- a/scripts/automacao/templates/modelo_informacao.docx
+++ b/scripts/automacao/templates/modelo_informacao.docx
@@ -151,17 +151,6 @@
           <w:lang w:val="pt-BR"/>
         </w:rPr>
       </w:pPr>
-    </w:p>
-    <w:p>
-      <w:pPr>
-        <w:jc w:val="both"/>
-        <w:rPr>
-          <w:rFonts w:ascii="Times New Roman" w:hAnsi="Times New Roman" w:cs="Times New Roman"/>
-          <w:sz w:val="24"/>
-          <w:szCs w:val="24"/>
-          <w:lang w:val="pt-BR"/>
-        </w:rPr>
-      </w:pPr>
       <w:r>
         <w:rPr>
           <w:rFonts w:ascii="Times New Roman" w:hAnsi="Times New Roman" w:cs="Times New Roman"/>
@@ -169,27 +158,7 @@
           <w:szCs w:val="24"/>
           <w:lang w:val="pt-BR"/>
         </w:rPr>
-        <w:t xml:space="preserve">{% for </w:t>
-      </w:r>
-      <w:proofErr w:type="spellStart"/>
-      <w:r>
-        <w:rPr>
-          <w:rFonts w:ascii="Times New Roman" w:hAnsi="Times New Roman" w:cs="Times New Roman"/>
-          <w:sz w:val="24"/>
-          <w:szCs w:val="24"/>
-          <w:lang w:val="pt-BR"/>
-        </w:rPr>
-        <w:t>paragrafo</w:t>
-      </w:r>
-      <w:proofErr w:type="spellEnd"/>
-      <w:r>
-        <w:rPr>
-          <w:rFonts w:ascii="Times New Roman" w:hAnsi="Times New Roman" w:cs="Times New Roman"/>
-          <w:sz w:val="24"/>
-          <w:szCs w:val="24"/>
-          <w:lang w:val="pt-BR"/>
-        </w:rPr>
-        <w:t xml:space="preserve"> in parágrafos %}</w:t>
+        <w:t>{% for paragrafo in parágrafos %}</w:t>
       </w:r>
     </w:p>
     <w:p>
@@ -237,27 +206,7 @@
           <w:szCs w:val="24"/>
           <w:lang w:val="pt-BR"/>
         </w:rPr>
-        <w:t xml:space="preserve">{% </w:t>
-      </w:r>
-      <w:proofErr w:type="spellStart"/>
-      <w:r>
-        <w:rPr>
-          <w:rFonts w:ascii="Times New Roman" w:hAnsi="Times New Roman" w:cs="Times New Roman"/>
-          <w:sz w:val="24"/>
-          <w:szCs w:val="24"/>
-          <w:lang w:val="pt-BR"/>
-        </w:rPr>
-        <w:t>endfor</w:t>
-      </w:r>
-      <w:proofErr w:type="spellEnd"/>
-      <w:r>
-        <w:rPr>
-          <w:rFonts w:ascii="Times New Roman" w:hAnsi="Times New Roman" w:cs="Times New Roman"/>
-          <w:sz w:val="24"/>
-          <w:szCs w:val="24"/>
-          <w:lang w:val="pt-BR"/>
-        </w:rPr>
-        <w:t xml:space="preserve"> %}</w:t>
+        <w:t>{% endfor %}</w:t>
       </w:r>
     </w:p>
     <w:p>

</xml_diff>